<commit_message>
added navigation to API
</commit_message>
<xml_diff>
--- a/API-Doc.docx
+++ b/API-Doc.docx
@@ -23,8 +23,7 @@
         <w:rPr/>
       </w:pPr>
       <w:r>
-        <w:rPr/>
-        <w:t>Gentleman includes a lightweight HTTP API that allows third-party apps to browse Gentleman’s menu, retrieve systems and games, and launch games through Gentleman’s existing launcher system.</w:t>
+        <w:t>Gentleman includes a lightweight HTTP API that allows third-party apps to browse Gentleman’s menu, retrieve systems and games, launch games through Gentleman’s existing launcher system, and remotely navigate the Gentleman interface.</w:t>
       </w:r>
     </w:p>
     <w:p>
@@ -4648,6 +4647,446 @@
     <w:p>
       <w:pPr>
         <w:pStyle w:val="Heading2"/>
+      </w:pPr>
+      <w:r>
+        <w:t>POST /api/input</w:t>
+      </w:r>
+    </w:p>
+    <w:p>
+      <w:pPr>
+        <w:pStyle w:val="BodyText"/>
+      </w:pPr>
+      <w:r>
+        <w:t>Sends a remote navigation action to the Gentleman interface.</w:t>
+      </w:r>
+    </w:p>
+    <w:p>
+      <w:pPr>
+        <w:pStyle w:val="BodyText"/>
+      </w:pPr>
+      <w:r>
+        <w:t>This endpoint uses Gentleman’s existing navigation behavior. Left and Right perform the same larger list jumps as the keyboard controls.</w:t>
+      </w:r>
+    </w:p>
+    <w:p>
+      <w:pPr>
+        <w:pStyle w:val="Heading3"/>
+      </w:pPr>
+      <w:r>
+        <w:t>Request</w:t>
+      </w:r>
+    </w:p>
+    <w:p>
+      <w:pPr>
+        <w:pStyle w:val="PreformattedText"/>
+      </w:pPr>
+      <w:r>
+        <w:t>POST /api/input</w:t>
+      </w:r>
+    </w:p>
+    <w:p>
+      <w:pPr>
+        <w:pStyle w:val="PreformattedText"/>
+      </w:pPr>
+      <w:r>
+        <w:t>Content-Type: application/json</w:t>
+      </w:r>
+    </w:p>
+    <w:p>
+      <w:pPr>
+        <w:pStyle w:val="PreformattedText"/>
+      </w:pPr>
+      <w:r>
+        <w:t>{</w:t>
+      </w:r>
+    </w:p>
+    <w:p>
+      <w:pPr>
+        <w:pStyle w:val="PreformattedText"/>
+      </w:pPr>
+      <w:r>
+        <w:t>"action": "up"</w:t>
+      </w:r>
+    </w:p>
+    <w:p>
+      <w:pPr>
+        <w:pStyle w:val="PreformattedText"/>
+      </w:pPr>
+      <w:r>
+        <w:t>}</w:t>
+      </w:r>
+    </w:p>
+    <w:p>
+      <w:pPr>
+        <w:pStyle w:val="Heading3"/>
+      </w:pPr>
+      <w:r>
+        <w:t>Supported Actions</w:t>
+      </w:r>
+    </w:p>
+    <w:p>
+      <w:pPr>
+        <w:pStyle w:val="PreformattedText"/>
+      </w:pPr>
+      <w:r>
+        <w:t>up       = move selection up</w:t>
+      </w:r>
+    </w:p>
+    <w:p>
+      <w:pPr>
+        <w:pStyle w:val="PreformattedText"/>
+      </w:pPr>
+      <w:r>
+        <w:t>down     = move selection down</w:t>
+      </w:r>
+    </w:p>
+    <w:p>
+      <w:pPr>
+        <w:pStyle w:val="PreformattedText"/>
+      </w:pPr>
+      <w:r>
+        <w:t>left     = jump backward through the current list</w:t>
+      </w:r>
+    </w:p>
+    <w:p>
+      <w:pPr>
+        <w:pStyle w:val="PreformattedText"/>
+      </w:pPr>
+      <w:r>
+        <w:t>right    = jump forward through the current list</w:t>
+      </w:r>
+    </w:p>
+    <w:p>
+      <w:pPr>
+        <w:pStyle w:val="PreformattedText"/>
+      </w:pPr>
+      <w:r>
+        <w:t>select   = activate the selected item</w:t>
+      </w:r>
+    </w:p>
+    <w:p>
+      <w:pPr>
+        <w:pStyle w:val="PreformattedText"/>
+      </w:pPr>
+      <w:r>
+        <w:t>back     = return to the previous menu</w:t>
+      </w:r>
+    </w:p>
+    <w:p>
+      <w:pPr>
+        <w:pStyle w:val="PreformattedText"/>
+      </w:pPr>
+      <w:r>
+        <w:t>favorite = favorite or unfavorite the selected game</w:t>
+      </w:r>
+    </w:p>
+    <w:p>
+      <w:pPr>
+        <w:pStyle w:val="Heading3"/>
+      </w:pPr>
+      <w:r>
+        <w:t>Favorite Availability</w:t>
+      </w:r>
+    </w:p>
+    <w:p>
+      <w:pPr>
+        <w:pStyle w:val="BodyText"/>
+      </w:pPr>
+      <w:r>
+        <w:t>The favorite action is only available while a game is selected in a game list. Remote clients should read GET /api/input/context before showing a Favorite or Unfavorite control.</w:t>
+      </w:r>
+    </w:p>
+    <w:p>
+      <w:pPr>
+        <w:pStyle w:val="Heading3"/>
+      </w:pPr>
+      <w:r>
+        <w:t>Response</w:t>
+      </w:r>
+    </w:p>
+    <w:p>
+      <w:pPr>
+        <w:pStyle w:val="PreformattedText"/>
+      </w:pPr>
+      <w:r>
+        <w:t>{</w:t>
+      </w:r>
+    </w:p>
+    <w:p>
+      <w:pPr>
+        <w:pStyle w:val="PreformattedText"/>
+      </w:pPr>
+      <w:r>
+        <w:t>"ok": true,</w:t>
+      </w:r>
+    </w:p>
+    <w:p>
+      <w:pPr>
+        <w:pStyle w:val="PreformattedText"/>
+      </w:pPr>
+      <w:r>
+        <w:t>"action": "up"</w:t>
+      </w:r>
+    </w:p>
+    <w:p>
+      <w:pPr>
+        <w:pStyle w:val="PreformattedText"/>
+      </w:pPr>
+      <w:r>
+        <w:t>}</w:t>
+      </w:r>
+    </w:p>
+    <w:p>
+      <w:pPr>
+        <w:pStyle w:val="Heading3"/>
+      </w:pPr>
+      <w:r>
+        <w:t>Invalid or Unavailable Action</w:t>
+      </w:r>
+    </w:p>
+    <w:p>
+      <w:pPr>
+        <w:pStyle w:val="PreformattedText"/>
+      </w:pPr>
+      <w:r>
+        <w:t>{</w:t>
+      </w:r>
+    </w:p>
+    <w:p>
+      <w:pPr>
+        <w:pStyle w:val="PreformattedText"/>
+      </w:pPr>
+      <w:r>
+        <w:t>"ok": false,</w:t>
+      </w:r>
+    </w:p>
+    <w:p>
+      <w:pPr>
+        <w:pStyle w:val="PreformattedText"/>
+      </w:pPr>
+      <w:r>
+        <w:t>"error": "action_not_available"</w:t>
+      </w:r>
+    </w:p>
+    <w:p>
+      <w:pPr>
+        <w:pStyle w:val="PreformattedText"/>
+      </w:pPr>
+      <w:r>
+        <w:t>}</w:t>
+      </w:r>
+    </w:p>
+    <w:p>
+      <w:pPr>
+        <w:pStyle w:val="Heading2"/>
+      </w:pPr>
+      <w:r>
+        <w:t>GET /api/input/context</w:t>
+      </w:r>
+    </w:p>
+    <w:p>
+      <w:pPr>
+        <w:pStyle w:val="BodyText"/>
+      </w:pPr>
+      <w:r>
+        <w:t>Returns the current Gentleman selection context for remote-control clients.</w:t>
+      </w:r>
+    </w:p>
+    <w:p>
+      <w:pPr>
+        <w:pStyle w:val="BodyText"/>
+      </w:pPr>
+      <w:r>
+        <w:t>Remote clients can use this response to determine whether the Favorite control should be visible and whether it should display Favorite or Unfavorite.</w:t>
+      </w:r>
+    </w:p>
+    <w:p>
+      <w:pPr>
+        <w:pStyle w:val="Heading3"/>
+      </w:pPr>
+      <w:r>
+        <w:t>Request</w:t>
+      </w:r>
+    </w:p>
+    <w:p>
+      <w:pPr>
+        <w:pStyle w:val="PreformattedText"/>
+      </w:pPr>
+      <w:r>
+        <w:t>GET /api/input/context</w:t>
+      </w:r>
+    </w:p>
+    <w:p>
+      <w:pPr>
+        <w:pStyle w:val="Heading3"/>
+      </w:pPr>
+      <w:r>
+        <w:t>Response: Game Selected</w:t>
+      </w:r>
+    </w:p>
+    <w:p>
+      <w:pPr>
+        <w:pStyle w:val="PreformattedText"/>
+      </w:pPr>
+      <w:r>
+        <w:t>{</w:t>
+      </w:r>
+    </w:p>
+    <w:p>
+      <w:pPr>
+        <w:pStyle w:val="PreformattedText"/>
+      </w:pPr>
+      <w:r>
+        <w:t>"ok": true,</w:t>
+      </w:r>
+    </w:p>
+    <w:p>
+      <w:pPr>
+        <w:pStyle w:val="PreformattedText"/>
+      </w:pPr>
+      <w:r>
+        <w:t>"mode": "roms",</w:t>
+      </w:r>
+    </w:p>
+    <w:p>
+      <w:pPr>
+        <w:pStyle w:val="PreformattedText"/>
+      </w:pPr>
+      <w:r>
+        <w:t>"favorite_available": true,</w:t>
+      </w:r>
+    </w:p>
+    <w:p>
+      <w:pPr>
+        <w:pStyle w:val="PreformattedText"/>
+      </w:pPr>
+      <w:r>
+        <w:t>"is_favorite": false,</w:t>
+      </w:r>
+    </w:p>
+    <w:p>
+      <w:pPr>
+        <w:pStyle w:val="PreformattedText"/>
+      </w:pPr>
+      <w:r>
+        <w:t>"selected_game": "Super Metroid.sfc"</w:t>
+      </w:r>
+    </w:p>
+    <w:p>
+      <w:pPr>
+        <w:pStyle w:val="PreformattedText"/>
+      </w:pPr>
+      <w:r>
+        <w:t>}</w:t>
+      </w:r>
+    </w:p>
+    <w:p>
+      <w:pPr>
+        <w:pStyle w:val="Heading3"/>
+      </w:pPr>
+      <w:r>
+        <w:t>Response: Favorite Action Unavailable</w:t>
+      </w:r>
+    </w:p>
+    <w:p>
+      <w:pPr>
+        <w:pStyle w:val="PreformattedText"/>
+      </w:pPr>
+      <w:r>
+        <w:t>{</w:t>
+      </w:r>
+    </w:p>
+    <w:p>
+      <w:pPr>
+        <w:pStyle w:val="PreformattedText"/>
+      </w:pPr>
+      <w:r>
+        <w:t>"ok": true,</w:t>
+      </w:r>
+    </w:p>
+    <w:p>
+      <w:pPr>
+        <w:pStyle w:val="PreformattedText"/>
+      </w:pPr>
+      <w:r>
+        <w:t>"mode": "menu",</w:t>
+      </w:r>
+    </w:p>
+    <w:p>
+      <w:pPr>
+        <w:pStyle w:val="PreformattedText"/>
+      </w:pPr>
+      <w:r>
+        <w:t>"favorite_available": false,</w:t>
+      </w:r>
+    </w:p>
+    <w:p>
+      <w:pPr>
+        <w:pStyle w:val="PreformattedText"/>
+      </w:pPr>
+      <w:r>
+        <w:t>"is_favorite": false,</w:t>
+      </w:r>
+    </w:p>
+    <w:p>
+      <w:pPr>
+        <w:pStyle w:val="PreformattedText"/>
+      </w:pPr>
+      <w:r>
+        <w:t>"selected_game": null</w:t>
+      </w:r>
+    </w:p>
+    <w:p>
+      <w:pPr>
+        <w:pStyle w:val="PreformattedText"/>
+      </w:pPr>
+      <w:r>
+        <w:t>}</w:t>
+      </w:r>
+    </w:p>
+    <w:p>
+      <w:pPr>
+        <w:pStyle w:val="Heading3"/>
+      </w:pPr>
+      <w:r>
+        <w:t>Context Fields</w:t>
+      </w:r>
+    </w:p>
+    <w:p>
+      <w:pPr>
+        <w:pStyle w:val="PreformattedText"/>
+      </w:pPr>
+      <w:r>
+        <w:t>mode               = current Gentleman screen or list mode</w:t>
+      </w:r>
+    </w:p>
+    <w:p>
+      <w:pPr>
+        <w:pStyle w:val="PreformattedText"/>
+      </w:pPr>
+      <w:r>
+        <w:t>favorite_available = true only when the selected item is a game</w:t>
+      </w:r>
+    </w:p>
+    <w:p>
+      <w:pPr>
+        <w:pStyle w:val="PreformattedText"/>
+      </w:pPr>
+      <w:r>
+        <w:t>is_favorite        = current favorite state of the selected game</w:t>
+      </w:r>
+    </w:p>
+    <w:p>
+      <w:pPr>
+        <w:pStyle w:val="PreformattedText"/>
+      </w:pPr>
+      <w:r>
+        <w:t>selected_game      = selected game name, or null when unavailable</w:t>
+      </w:r>
+    </w:p>
+    <w:p>
+      <w:pPr>
+        <w:pStyle w:val="Heading2"/>
         <w:bidi w:val="0"/>
         <w:jc w:val="start"/>
         <w:rPr/>
@@ -6566,6 +7005,93 @@
       </w:pPr>
       <w:r>
         <w:t># requests.post(f"{BASE_URL}/api/session/force-close", json={})</w:t>
+      </w:r>
+    </w:p>
+    <w:p>
+      <w:pPr>
+        <w:pStyle w:val="PreformattedText"/>
+      </w:pPr>
+    </w:p>
+    <w:p>
+      <w:pPr>
+        <w:pStyle w:val="PreformattedText"/>
+      </w:pPr>
+      <w:r>
+        <w:t># Read remote-control context</w:t>
+      </w:r>
+    </w:p>
+    <w:p>
+      <w:pPr>
+        <w:pStyle w:val="PreformattedText"/>
+      </w:pPr>
+      <w:r>
+        <w:t>context = requests.get(f"{BASE_URL}/api/input/context").json()</w:t>
+      </w:r>
+    </w:p>
+    <w:p>
+      <w:pPr>
+        <w:pStyle w:val="PreformattedText"/>
+      </w:pPr>
+      <w:r>
+        <w:t>print(context)</w:t>
+      </w:r>
+    </w:p>
+    <w:p>
+      <w:pPr>
+        <w:pStyle w:val="PreformattedText"/>
+      </w:pPr>
+    </w:p>
+    <w:p>
+      <w:pPr>
+        <w:pStyle w:val="PreformattedText"/>
+      </w:pPr>
+      <w:r>
+        <w:t># Move the Gentleman selection and activate it</w:t>
+      </w:r>
+    </w:p>
+    <w:p>
+      <w:pPr>
+        <w:pStyle w:val="PreformattedText"/>
+      </w:pPr>
+      <w:r>
+        <w:t>requests.post(f"{BASE_URL}/api/input", json={"action": "down"})</w:t>
+      </w:r>
+    </w:p>
+    <w:p>
+      <w:pPr>
+        <w:pStyle w:val="PreformattedText"/>
+      </w:pPr>
+      <w:r>
+        <w:t>requests.post(f"{BASE_URL}/api/input", json={"action": "select"})</w:t>
+      </w:r>
+    </w:p>
+    <w:p>
+      <w:pPr>
+        <w:pStyle w:val="PreformattedText"/>
+      </w:pPr>
+    </w:p>
+    <w:p>
+      <w:pPr>
+        <w:pStyle w:val="PreformattedText"/>
+      </w:pPr>
+      <w:r>
+        <w:t># Toggle favorite only when the context allows it</w:t>
+      </w:r>
+    </w:p>
+    <w:p>
+      <w:pPr>
+        <w:pStyle w:val="PreformattedText"/>
+      </w:pPr>
+      <w:r>
+        <w:t>if context.get("favorite_available"):</w:t>
+      </w:r>
+    </w:p>
+    <w:p>
+      <w:pPr>
+        <w:pStyle w:val="PreformattedText"/>
+      </w:pPr>
+      <w:r>
+        <w:t xml:space="preserve">    requests.post(f"{BASE_URL}/api/input", json={"action": "favorite"})</w:t>
       </w:r>
     </w:p>
     <w:sectPr>

</xml_diff>